<commit_message>
Add Acknowledgment section with corrected Bhopal institution names
The user's supplied acknowledgment text named HMC/HDA (Haldia
Municipal Corporation / Haldia Development Authority), which belongs
to a different paper by the same authors. Swapped to Bhopal Municipal
Corporation per author confirmation, keeping the rest of the wording
(GIS Lab, USGS, SOI, editorial board thanks) as given. Flagged the
exact MP urban development authority name for author confirmation.

Co-Authored-By: Claude Sonnet 5 <noreply@anthropic.com>
Claude-Session: https://claude.ai/code/session_01L1F9LReU4niduJQwfTFQLh
</commit_message>
<xml_diff>
--- a/Bhopal_Urban_Morphology_UMAP/Bhopal_Urban_Morphology_FullPaper_DRAFT.docx
+++ b/Bhopal_Urban_Morphology_UMAP/Bhopal_Urban_Morphology_FullPaper_DRAFT.docx
@@ -1809,6 +1809,19 @@
     <w:p>
       <w:pPr>
         <w:spacing w:after="120"/>
+        <w:jc w:val="both"/>
+      </w:pPr>
+      <w:r>
+        <w:rPr>
+          <w:sz w:val="20"/>
+          <w:szCs w:val="20"/>
+        </w:rPr>
+        <w:t xml:space="preserve">The authors would like to thank the Commissioner of the Bhopal Municipal Corporation (BMC) and the Planning and Development Department of the concerned Madhya Pradesh urban development authority for providing the study area datasets, and also thank the GIS Lab of the Department of Geography, Faculty of Earth Science, IGNTU, India. The authors also thank the USGS and the Survey of India (SOI) for their freely available satellite images and datasets. The authors would also like to express sincere gratitude to the entire editorial board and reviewers for their insightful comments and suggestions, which have significantly improved the manuscript.</w:t>
+      </w:r>
+    </w:p>
+    <w:p>
+      <w:pPr>
+        <w:spacing w:after="120"/>
       </w:pPr>
       <w:r>
         <w:rPr>
@@ -1818,7 +1831,7 @@
           <w:sz w:val="20"/>
           <w:szCs w:val="20"/>
         </w:rPr>
-        <w:t xml:space="preserve">[AUTHOR TO CONFIRM: add any funding source, data-provider acknowledgment, or institutional support statement here]</w:t>
+        <w:t xml:space="preserve">[AUTHOR TO CONFIRM: confirm the exact Bhopal-side institution names/titles above (e.g., the specific MP urban development authority you actually obtained data from) before submission]</w:t>
       </w:r>
     </w:p>
     <w:p>

</xml_diff>

<commit_message>
Fix obf_n/bld_n/wsf_n normalization formulas with verified data
Independently verified (against all 495 rows of Bhopal_umi-grid.csv)
that obf_n, bld_n, and wsf_n are max-normalizations of obf_pct,
fid_count, and DN_mean respectively, not the percent/100 or binary-
mask forms used in earlier drafts. Old obf_n formula was off by up
to 0.47; the corrected max-normalization form matches to within
0.0005 (rounding) across every cell. UMI and UMI_w formulas are
unaffected since they consume these fields as inputs.

Rewrote paper Eqs. (7)-(9) with the corrected formulas and narrowed
the WSF confirmation flag: the math is now verified, only the literal
QGIS expression syntax remains unconfirmed.

Co-Authored-By: Claude Sonnet 5 <noreply@anthropic.com>
Claude-Session: https://claude.ai/code/session_01L1F9LReU4niduJQwfTFQLh
</commit_message>
<xml_diff>
--- a/Bhopal_Urban_Morphology_UMAP/Bhopal_Urban_Morphology_FullPaper_DRAFT.docx
+++ b/Bhopal_Urban_Morphology_UMAP/Bhopal_Urban_Morphology_FullPaper_DRAFT.docx
@@ -788,7 +788,7 @@
           <w:sz w:val="20"/>
           <w:szCs w:val="20"/>
         </w:rPr>
-        <w:t xml:space="preserve">7) OBF percentage and its normalized form, read directly from the grid attribute fields obf_pct and obf_n:</w:t>
+        <w:t xml:space="preserve">7) OBF percentage and its normalized form. OBF% is read directly from the grid attribute field obf_pct; obf_n was verified, across all 495 grid cells, to be a max-normalization of obf_pct rather than a simple percent-to-fraction conversion (max abs. residual 0.0005 against max-normalization vs. 0.47 against the percent/100 form, ruling the latter out):</w:t>
       </w:r>
     </w:p>
     <w:p>
@@ -804,7 +804,7 @@
           <w:sz w:val="20"/>
           <w:szCs w:val="20"/>
         </w:rPr>
-        <w:t xml:space="preserve">OBF%_i = (A_OBF,i / A_grid,i) × 100,     OBF_n,i = OBF%_i / 100</w:t>
+        <w:t xml:space="preserve">OBF%_i = (A_OBF,i / A_grid,i) × 100,     OBF_n,i = OBF%_i / max(OBF%)</w:t>
       </w:r>
       <w:r>
         <w:rPr>
@@ -826,20 +826,20 @@
           <w:sz w:val="20"/>
           <w:szCs w:val="20"/>
         </w:rPr>
-        <w:t xml:space="preserve">verified against the attribute table (obf_pct ranges 0-53.151, obf_n correspondingly 0-0.532).</w:t>
-      </w:r>
-    </w:p>
-    <w:p>
-      <w:pPr>
-        <w:spacing w:after="120"/>
-        <w:jc w:val="both"/>
-      </w:pPr>
-      <w:r>
-        <w:rPr>
-          <w:sz w:val="20"/>
-          <w:szCs w:val="20"/>
-        </w:rPr>
-        <w:t xml:space="preserve">8) WSF normalization: the WSF layer is a binary settlement mask (DN = 255 built-up, DN = 0 otherwise); the stored field wsf_n is consistent with the built-up pixel fraction per cell,</w:t>
+        <w:t xml:space="preserve">with max(OBF%) = 53.151 (the dataset maximum, at grid cell id 671).</w:t>
+      </w:r>
+    </w:p>
+    <w:p>
+      <w:pPr>
+        <w:spacing w:after="120"/>
+        <w:jc w:val="both"/>
+      </w:pPr>
+      <w:r>
+        <w:rPr>
+          <w:sz w:val="20"/>
+          <w:szCs w:val="20"/>
+        </w:rPr>
+        <w:t xml:space="preserve">8) Building-count normalization (bld_n), likewise verified as a max-normalization of the raw building count (fid_count) across all 423 populated cells (max abs. residual 0.0005):</w:t>
       </w:r>
     </w:p>
     <w:p>
@@ -855,7 +855,7 @@
           <w:sz w:val="20"/>
           <w:szCs w:val="20"/>
         </w:rPr>
-        <w:t xml:space="preserve">WSF_n,i = N_built-up,i / N_valid,i</w:t>
+        <w:t xml:space="preserve">bld_n,i = fid_count_i / max(fid_count),   max(fid_count) = 1771</w:t>
       </w:r>
       <w:r>
         <w:rPr>
@@ -870,29 +870,14 @@
     <w:p>
       <w:pPr>
         <w:spacing w:after="120"/>
-      </w:pPr>
-      <w:r>
-        <w:rPr>
-          <w:i/>
-          <w:iCs/>
-          <w:color w:val="C00000"/>
-          <w:sz w:val="20"/>
-          <w:szCs w:val="20"/>
-        </w:rPr>
-        <w:t xml:space="preserve">[AUTHOR TO CONFIRM: the precise QGIS zonal-statistics expression that generated wsf_n was not recovered from the delivered shapefile -- Eq. (8) is the conceptually consistent form, not a confirmed source expression]</w:t>
-      </w:r>
-    </w:p>
-    <w:p>
-      <w:pPr>
-        <w:spacing w:after="120"/>
-        <w:jc w:val="both"/>
-      </w:pPr>
-      <w:r>
-        <w:rPr>
-          <w:sz w:val="20"/>
-          <w:szCs w:val="20"/>
-        </w:rPr>
-        <w:t xml:space="preserve">9) Urban Morphological Index (UMI): reverse-derived and numerically verified against every one of the 423 valid grid cells in the delivered attribute table (e.g., cell id 247: obf_n=0.009, bld_n=0.009, wsf_n=0.988 → UMI=0.335 exactly as stored),</w:t>
+        <w:jc w:val="both"/>
+      </w:pPr>
+      <w:r>
+        <w:rPr>
+          <w:sz w:val="20"/>
+          <w:szCs w:val="20"/>
+        </w:rPr>
+        <w:t xml:space="preserve">9) WSF normalization (wsf_n), verified as a max-normalization of the mean WSF settlement-likelihood value (DN_mean) per cell across all 495 cells (max abs. residual 0.0005):</w:t>
       </w:r>
     </w:p>
     <w:p>
@@ -908,7 +893,7 @@
           <w:sz w:val="20"/>
           <w:szCs w:val="20"/>
         </w:rPr>
-        <w:t xml:space="preserve">UMI_i = (OBF_n,i + bld_n,i + WSF_n,i) / 3</w:t>
+        <w:t xml:space="preserve">WSF_n,i = DN_mean_i / max(DN_mean),   max(DN_mean) = 248.625</w:t>
       </w:r>
       <w:r>
         <w:rPr>
@@ -923,14 +908,29 @@
     <w:p>
       <w:pPr>
         <w:spacing w:after="120"/>
-        <w:jc w:val="both"/>
-      </w:pPr>
-      <w:r>
-        <w:rPr>
-          <w:sz w:val="20"/>
-          <w:szCs w:val="20"/>
-        </w:rPr>
-        <w:t xml:space="preserve">10) Weighted UMI (UMI_w): unlike UMI, this field is not a simple mean. We recovered its weighting by ordinary least-squares regression of UMI_w on (OBF_n, bld_n, WSF_n) with no intercept across all 423 valid cells, obtaining weights of 0.400, 0.400, and 0.200 respectively, with a maximum absolute residual of 0.00046 across every cell (consistent with field rounding rather than model error):</w:t>
+      </w:pPr>
+      <w:r>
+        <w:rPr>
+          <w:i/>
+          <w:iCs/>
+          <w:color w:val="C00000"/>
+          <w:sz w:val="20"/>
+          <w:szCs w:val="20"/>
+        </w:rPr>
+        <w:t xml:space="preserve">[AUTHOR TO CONFIRM: the exact QGIS Field Calculator expression syntax for obf_n, bld_n, and wsf_n was not recovered from the delivered files -- the mathematical form (max-normalization) is independently verified against all grid cells to within rounding error, but the literal expression text used in QGIS is not confirmed]</w:t>
+      </w:r>
+    </w:p>
+    <w:p>
+      <w:pPr>
+        <w:spacing w:after="120"/>
+        <w:jc w:val="both"/>
+      </w:pPr>
+      <w:r>
+        <w:rPr>
+          <w:sz w:val="20"/>
+          <w:szCs w:val="20"/>
+        </w:rPr>
+        <w:t xml:space="preserve">10) Urban Morphological Index (UMI): verified against every one of the 423 valid grid cells in the delivered attribute table (e.g., cell id 247: obf_n=0.009, bld_n=0.009, wsf_n=0.988 → UMI=0.335 exactly as stored),</w:t>
       </w:r>
     </w:p>
     <w:p>
@@ -946,7 +946,7 @@
           <w:sz w:val="20"/>
           <w:szCs w:val="20"/>
         </w:rPr>
-        <w:t xml:space="preserve">UMI_w,i = 0.4·OBF_n,i + 0.4·bld_n,i + 0.2·WSF_n,i</w:t>
+        <w:t xml:space="preserve">UMI_i = (OBF_n,i + bld_n,i + WSF_n,i) / 3</w:t>
       </w:r>
       <w:r>
         <w:rPr>
@@ -961,6 +961,44 @@
     <w:p>
       <w:pPr>
         <w:spacing w:after="120"/>
+        <w:jc w:val="both"/>
+      </w:pPr>
+      <w:r>
+        <w:rPr>
+          <w:sz w:val="20"/>
+          <w:szCs w:val="20"/>
+        </w:rPr>
+        <w:t xml:space="preserve">11) Weighted UMI (UMI_w): unlike UMI, this field is not a simple mean. We recovered its weighting by ordinary least-squares regression of UMI_w on (OBF_n, bld_n, WSF_n) with no intercept across all 423 valid cells, obtaining weights of 0.400, 0.400, and 0.200 respectively, with a maximum absolute residual of 0.00046 across every cell (consistent with field rounding rather than model error):</w:t>
+      </w:r>
+    </w:p>
+    <w:p>
+      <w:pPr>
+        <w:spacing w:after="100" w:before="60"/>
+        <w:jc w:val="center"/>
+      </w:pPr>
+      <w:r>
+        <w:rPr>
+          <w:rFonts w:ascii="Cambria Math" w:cs="Cambria Math" w:eastAsia="Cambria Math" w:hAnsi="Cambria Math"/>
+          <w:i/>
+          <w:iCs/>
+          <w:sz w:val="20"/>
+          <w:szCs w:val="20"/>
+        </w:rPr>
+        <w:t xml:space="preserve">UMI_w,i = 0.4·OBF_n,i + 0.4·bld_n,i + 0.2·WSF_n,i</w:t>
+      </w:r>
+      <w:r>
+        <w:rPr>
+          <w:i w:val="false"/>
+          <w:iCs w:val="false"/>
+          <w:sz w:val="20"/>
+          <w:szCs w:val="20"/>
+        </w:rPr>
+        <w:t xml:space="preserve">    (11)</w:t>
+      </w:r>
+    </w:p>
+    <w:p>
+      <w:pPr>
+        <w:spacing w:after="120"/>
       </w:pPr>
       <w:r>
         <w:rPr>
@@ -970,7 +1008,7 @@
           <w:sz w:val="20"/>
           <w:szCs w:val="20"/>
         </w:rPr>
-        <w:t xml:space="preserve">[AUTHOR TO CONFIRM: Eq. (10) is an empirically recovered fit (n=423, max abs. residual 0.00046), not a value confirmed from the original processing script -- state this explicitly in the paper and, if possible, confirm against the source QGIS model before submission]</w:t>
+        <w:t xml:space="preserve">[AUTHOR TO CONFIRM: Eq. (11) is an empirically recovered fit (n=423, max abs. residual 0.00046), not a value confirmed from the original processing script -- state this explicitly in the paper and, if possible, confirm against the source QGIS model before submission]</w:t>
       </w:r>
     </w:p>
     <w:p>
@@ -1024,7 +1062,7 @@
           <w:sz w:val="20"/>
           <w:szCs w:val="20"/>
         </w:rPr>
-        <w:t xml:space="preserve">    (11)</w:t>
+        <w:t xml:space="preserve">    (12)</w:t>
       </w:r>
     </w:p>
     <w:p>
@@ -1062,7 +1100,7 @@
           <w:sz w:val="20"/>
           <w:szCs w:val="20"/>
         </w:rPr>
-        <w:t xml:space="preserve">    (12)</w:t>
+        <w:t xml:space="preserve">    (13)</w:t>
       </w:r>
     </w:p>
     <w:p>
@@ -1131,7 +1169,7 @@
           <w:sz w:val="20"/>
           <w:szCs w:val="20"/>
         </w:rPr>
-        <w:t xml:space="preserve">    (13)</w:t>
+        <w:t xml:space="preserve">    (14)</w:t>
       </w:r>
     </w:p>
     <w:p>
@@ -1242,7 +1280,7 @@
           <w:sz w:val="20"/>
           <w:szCs w:val="20"/>
         </w:rPr>
-        <w:t xml:space="preserve">    (14)</w:t>
+        <w:t xml:space="preserve">    (15)</w:t>
       </w:r>
     </w:p>
     <w:p>
@@ -1267,7 +1305,7 @@
           <w:sz w:val="20"/>
           <w:szCs w:val="20"/>
         </w:rPr>
-        <w:t xml:space="preserve">    (15)</w:t>
+        <w:t xml:space="preserve">    (16)</w:t>
       </w:r>
     </w:p>
     <w:p>
@@ -1756,7 +1794,7 @@
           <w:sz w:val="20"/>
           <w:szCs w:val="20"/>
         </w:rPr>
-        <w:t xml:space="preserve">This analysis is cross-sectional and does not capture temporal morphological change. The 1 km grid risks an ecological-fallacy effect in which within-cell heterogeneity is averaged out. The k=6 solution was justified on interpretability rather than statistical optimality (Section IV-B). The WSF zonal-statistics expression (Eq. 8), the UMI_w weighting (Eq. 10, empirically recovered but not source-confirmed), the original LISA spatial-weights definition (Section III-F), the precise OBF data provenance (Section III-A), and UMAP hyperparameters (Section III-C) all require author confirmation before submission, as flagged in place above. Cluster labels have not yet been validated against independent ground-truth imagery or socioeconomic data.</w:t>
+        <w:t xml:space="preserve">This analysis is cross-sectional and does not capture temporal morphological change. The 1 km grid risks an ecological-fallacy effect in which within-cell heterogeneity is averaged out. The k=6 solution was justified on interpretability rather than statistical optimality (Section IV-B). The literal QGIS Field Calculator expression syntax for obf_n/bld_n/wsf_n (mathematically verified as max-normalization, Eqs. 7-9), the UMI_w weighting (Eq. 11, empirically recovered but not source-confirmed), the original LISA spatial-weights definition (Section III-F), the precise OBF data provenance (Section III-A), and UMAP hyperparameters (Section III-C) all require author confirmation before submission, as flagged in place above. Cluster labels have not yet been validated against independent ground-truth imagery or socioeconomic data.</w:t>
       </w:r>
     </w:p>
     <w:p>

</xml_diff>

<commit_message>
Resolve UMAP hyperparameters, LISA weights, and QGIS expressions
Author supplied and confirmed: (1) literal QGIS Field Calculator
expressions for obf_n/bld_n/wsf_n, matching the independently verified
max-normalization math exactly; (2) UMAP hyperparameters
(n_neighbors=15, min_dist=0.10, random_state=42); (3) original LISA
spatial weights (k-nearest-neighbor, k=5, 999 permutations), now
stated explicitly alongside this project's own rook-contiguity global
Moran's I check rather than left ambiguous.

Down to 4 remaining flags: OBF provenance, UMI_w source script,
acknowledgment institution name, and the Ghosh 2019 citation details.

Co-Authored-By: Claude Sonnet 5 <noreply@anthropic.com>
Claude-Session: https://claude.ai/code/session_01L1F9LReU4niduJQwfTFQLh
</commit_message>
<xml_diff>
--- a/Bhopal_Urban_Morphology_UMAP/Bhopal_Urban_Morphology_FullPaper_DRAFT.docx
+++ b/Bhopal_Urban_Morphology_UMAP/Bhopal_Urban_Morphology_FullPaper_DRAFT.docx
@@ -908,16 +908,14 @@
     <w:p>
       <w:pPr>
         <w:spacing w:after="120"/>
-      </w:pPr>
-      <w:r>
-        <w:rPr>
-          <w:i/>
-          <w:iCs/>
-          <w:color w:val="C00000"/>
-          <w:sz w:val="20"/>
-          <w:szCs w:val="20"/>
-        </w:rPr>
-        <w:t xml:space="preserve">[AUTHOR TO CONFIRM: the exact QGIS Field Calculator expression syntax for obf_n, bld_n, and wsf_n was not recovered from the delivered files -- the mathematical form (max-normalization) is independently verified against all grid cells to within rounding error, but the literal expression text used in QGIS is not confirmed]</w:t>
+        <w:jc w:val="both"/>
+      </w:pPr>
+      <w:r>
+        <w:rPr>
+          <w:sz w:val="20"/>
+          <w:szCs w:val="20"/>
+        </w:rPr>
+        <w:t xml:space="preserve">The corresponding QGIS Field Calculator expressions, as recalled by the authors, are "obf_pct" / maximum("obf_pct"), "fid_count" / maximum("fid_count"), and "DN_mean" / maximum("DN_mean") respectively -- consistent with the independently verified mathematical form above.</w:t>
       </w:r>
     </w:p>
     <w:p>
@@ -1106,16 +1104,14 @@
     <w:p>
       <w:pPr>
         <w:spacing w:after="120"/>
-      </w:pPr>
-      <w:r>
-        <w:rPr>
-          <w:i/>
-          <w:iCs/>
-          <w:color w:val="C00000"/>
-          <w:sz w:val="20"/>
-          <w:szCs w:val="20"/>
-        </w:rPr>
-        <w:t xml:space="preserve">[AUTHOR TO CONFIRM: UMAP hyperparameters used (n_neighbors, min_dist, metric, random_state) -- required for reproducibility]</w:t>
+        <w:jc w:val="both"/>
+      </w:pPr>
+      <w:r>
+        <w:rPr>
+          <w:sz w:val="20"/>
+          <w:szCs w:val="20"/>
+        </w:rPr>
+        <w:t xml:space="preserve">with hyperparameters n_neighbors=15, min_dist=0.10, n_components=2, metric=Euclidean, and random_state=42.</w:t>
       </w:r>
     </w:p>
     <w:p>
@@ -1227,35 +1223,20 @@
           <w:sz w:val="20"/>
           <w:szCs w:val="20"/>
         </w:rPr>
-        <w:t xml:space="preserve">Two distinct Moran's I analyses are reported and are kept explicitly separate because they were not necessarily built with the same spatial-weights definition. First, a Local Moran's I (LISA) map was produced in the original GIS workflow (Fig. 3), classifying each cell into High-High, Low-High, Low-Low, or High-Low quadrants at p&lt;0.05.</w:t>
-      </w:r>
-    </w:p>
-    <w:p>
-      <w:pPr>
-        <w:spacing w:after="120"/>
-      </w:pPr>
-      <w:r>
-        <w:rPr>
-          <w:i/>
-          <w:iCs/>
-          <w:color w:val="C00000"/>
-          <w:sz w:val="20"/>
-          <w:szCs w:val="20"/>
-        </w:rPr>
-        <w:t xml:space="preserve">[AUTHOR TO CONFIRM: the spatial-weights specification (queen/rook contiguity, k-nearest-neighbor, or distance band) used to generate the original LISA shapefile was not recoverable from the delivered files and must be confirmed by the authors from the original QGIS project before submission]</w:t>
-      </w:r>
-    </w:p>
-    <w:p>
-      <w:pPr>
-        <w:spacing w:after="120"/>
-        <w:jc w:val="both"/>
-      </w:pPr>
-      <w:r>
-        <w:rPr>
-          <w:sz w:val="20"/>
-          <w:szCs w:val="20"/>
-        </w:rPr>
-        <w:t xml:space="preserve">Second, as an independent validation check for this study, we separately computed a global Moran's I on the composite UMI surface using an explicitly defined rook (4-neighbor edge) contiguity matrix built directly from the regular grid's row and column indices, row-standardized, with significance assessed via a 999-permutation test rather than an assumed normal approximation. The general form of Moran's I is [12], and of the local statistic [3], [11]:</w:t>
+        <w:t xml:space="preserve">Two distinct Moran's I analyses are reported and are kept explicitly separate because they were not built with the same spatial-weights definition. First, a Local Moran's I (LISA) map was produced in the original GIS workflow (Fig. 3) using k-nearest-neighbor weights (k=5) and a 999-permutation significance test, classifying each cell into High-High, Low-High, Low-Low, or High-Low quadrants at p&lt;0.05.</w:t>
+      </w:r>
+    </w:p>
+    <w:p>
+      <w:pPr>
+        <w:spacing w:after="120"/>
+        <w:jc w:val="both"/>
+      </w:pPr>
+      <w:r>
+        <w:rPr>
+          <w:sz w:val="20"/>
+          <w:szCs w:val="20"/>
+        </w:rPr>
+        <w:t xml:space="preserve">Second, and separately, as an independent validation check for this study, we computed a global Moran's I on the composite UMI surface using an explicitly defined rook (4-neighbor edge) contiguity matrix built directly from the regular grid's row and column indices, row-standardized, with significance likewise assessed via a 999-permutation test. Because the two analyses use different neighbourhood definitions (k=5 nearest-neighbor for the original LISA map vs. rook contiguity for this validation check), their results are complementary evidence rather than a single computation reported twice. The general form of Moran's I is [12], and of the local statistic [3], [11]:</w:t>
       </w:r>
     </w:p>
     <w:p>
@@ -1794,7 +1775,7 @@
           <w:sz w:val="20"/>
           <w:szCs w:val="20"/>
         </w:rPr>
-        <w:t xml:space="preserve">This analysis is cross-sectional and does not capture temporal morphological change. The 1 km grid risks an ecological-fallacy effect in which within-cell heterogeneity is averaged out. The k=6 solution was justified on interpretability rather than statistical optimality (Section IV-B). The literal QGIS Field Calculator expression syntax for obf_n/bld_n/wsf_n (mathematically verified as max-normalization, Eqs. 7-9), the UMI_w weighting (Eq. 11, empirically recovered but not source-confirmed), the original LISA spatial-weights definition (Section III-F), the precise OBF data provenance (Section III-A), and UMAP hyperparameters (Section III-C) all require author confirmation before submission, as flagged in place above. Cluster labels have not yet been validated against independent ground-truth imagery or socioeconomic data.</w:t>
+        <w:t xml:space="preserve">This analysis is cross-sectional and does not capture temporal morphological change. The 1 km grid risks an ecological-fallacy effect in which within-cell heterogeneity is averaged out. The k=6 solution was justified on interpretability rather than statistical optimality (Section IV-B). The UMI_w weighting (Eq. 11) remains an empirically recovered fit rather than a value confirmed from the original processing script, and the precise OBF data provenance (source, version, imagery vintage, access date; Section III-A) is still unconfirmed and required for the Data Availability statement. Cluster labels have not yet been validated against independent ground-truth imagery or socioeconomic data.</w:t>
       </w:r>
     </w:p>
     <w:p>

</xml_diff>

<commit_message>
Add verified DOIs to references
Added DOIs for 9 of 12 references, each confirmed via search rather
than guessed: Jochem 2021, McInnes 2018 (UMAP), Anselin 1995 (LISA),
Marconcini 2020 (WSF), Rousseeuw 1987 (silhouette), Davies-Bouldin
1979, Sirko 2021 (Open Buildings), Getis-Ord 1992, Moran 1950.
MacQueen 1967 (pre-DOI proceedings) and the National Commission on
Population report (no DOI, government report) are annotated as such
rather than left silently blank. Ghosh 2019 remains flagged pending
author confirmation of the full citation.

Co-Authored-By: Claude Sonnet 5 <noreply@anthropic.com>
Claude-Session: https://claude.ai/code/session_01L1F9LReU4niduJQwfTFQLh
</commit_message>
<xml_diff>
--- a/Bhopal_Urban_Morphology_UMAP/Bhopal_Urban_Morphology_FullPaper_DRAFT.docx
+++ b/Bhopal_Urban_Morphology_UMAP/Bhopal_Urban_Morphology_FullPaper_DRAFT.docx
@@ -2825,7 +2825,7 @@
           <w:sz w:val="18"/>
           <w:szCs w:val="18"/>
         </w:rPr>
-        <w:t xml:space="preserve">[1] W. C. Jochem, D. R. Leasure, O. Pannell, H. R. Chamberlain, P. Jones, and A. J. Tatem, "Classifying settlement types from multi-scale spatial patterns of building footprints," Environ. Plan. B: Urban Anal. City Sci., vol. 48, no. 5, pp. 1161-1179, 2021.</w:t>
+        <w:t xml:space="preserve">[1] W. C. Jochem, D. R. Leasure, O. Pannell, H. R. Chamberlain, P. Jones, and A. J. Tatem, "Classifying settlement types from multi-scale spatial patterns of building footprints," Environ. Plan. B: Urban Anal. City Sci., vol. 48, no. 5, pp. 1161-1179, 2021, doi: 10.1177/2399808320921208.</w:t>
       </w:r>
     </w:p>
     <w:p>
@@ -2838,7 +2838,7 @@
           <w:sz w:val="18"/>
           <w:szCs w:val="18"/>
         </w:rPr>
-        <w:t xml:space="preserve">[2] L. McInnes, J. Healy, and J. Melville, "UMAP: Uniform Manifold Approximation and Projection for Dimension Reduction," arXiv:1802.03426, 2018.</w:t>
+        <w:t xml:space="preserve">[2] L. McInnes, J. Healy, and J. Melville, "UMAP: Uniform Manifold Approximation and Projection for Dimension Reduction," arXiv:1802.03426, 2018, doi: 10.48550/arXiv.1802.03426.</w:t>
       </w:r>
     </w:p>
     <w:p>
@@ -2851,7 +2851,7 @@
           <w:sz w:val="18"/>
           <w:szCs w:val="18"/>
         </w:rPr>
-        <w:t xml:space="preserve">[3] L. Anselin, "Local Indicators of Spatial Association-LISA," Geogr. Anal., vol. 27, no. 2, pp. 93-115, 1995.</w:t>
+        <w:t xml:space="preserve">[3] L. Anselin, "Local Indicators of Spatial Association-LISA," Geogr. Anal., vol. 27, no. 2, pp. 93-115, 1995, doi: 10.1111/j.1538-4632.1995.tb00338.x.</w:t>
       </w:r>
     </w:p>
     <w:p>
@@ -2864,7 +2864,7 @@
           <w:sz w:val="18"/>
           <w:szCs w:val="18"/>
         </w:rPr>
-        <w:t xml:space="preserve">[4] M. Marconcini et al., "Outlining where humans live: the World Settlement Footprint 2015," Sci. Data, vol. 7, art. 242, 2020.</w:t>
+        <w:t xml:space="preserve">[4] M. Marconcini et al., "Outlining where humans live: the World Settlement Footprint 2015," Sci. Data, vol. 7, art. 242, 2020, doi: 10.1038/s41597-020-00580-5.</w:t>
       </w:r>
     </w:p>
     <w:p>
@@ -2877,7 +2877,7 @@
           <w:sz w:val="18"/>
           <w:szCs w:val="18"/>
         </w:rPr>
-        <w:t xml:space="preserve">[5] J. MacQueen, "Some methods for classification and analysis of multivariate observations," in Proc. 5th Berkeley Symp. Math. Stat. Probab., vol. 1, pp. 281-297, 1967.</w:t>
+        <w:t xml:space="preserve">[5] J. MacQueen, "Some methods for classification and analysis of multivariate observations," in Proc. 5th Berkeley Symp. Math. Stat. Probab., vol. 1, pp. 281-297, 1967. (No DOI -- pre-DOI-era conference proceedings.)</w:t>
       </w:r>
     </w:p>
     <w:p>
@@ -2903,7 +2903,7 @@
           <w:sz w:val="18"/>
           <w:szCs w:val="18"/>
         </w:rPr>
-        <w:t xml:space="preserve">[7] P. J. Rousseeuw, "Silhouettes: A graphical aid to the interpretation and validation of cluster analysis," J. Comput. Appl. Math., vol. 20, pp. 53-65, 1987.</w:t>
+        <w:t xml:space="preserve">[7] P. J. Rousseeuw, "Silhouettes: A graphical aid to the interpretation and validation of cluster analysis," J. Comput. Appl. Math., vol. 20, pp. 53-65, 1987, doi: 10.1016/0377-0427(87)90125-7.</w:t>
       </w:r>
     </w:p>
     <w:p>
@@ -2916,7 +2916,7 @@
           <w:sz w:val="18"/>
           <w:szCs w:val="18"/>
         </w:rPr>
-        <w:t xml:space="preserve">[8] D. L. Davies and D. W. Bouldin, "A Cluster Separation Measure," IEEE Trans. Pattern Anal. Mach. Intell., vol. PAMI-1, no. 2, pp. 224-227, 1979.</w:t>
+        <w:t xml:space="preserve">[8] D. L. Davies and D. W. Bouldin, "A Cluster Separation Measure," IEEE Trans. Pattern Anal. Mach. Intell., vol. PAMI-1, no. 2, pp. 224-227, 1979, doi: 10.1109/TPAMI.1979.4766909.</w:t>
       </w:r>
     </w:p>
     <w:p>
@@ -2929,7 +2929,7 @@
           <w:sz w:val="18"/>
           <w:szCs w:val="18"/>
         </w:rPr>
-        <w:t xml:space="preserve">[9] W. Sirko et al., "Continental-Scale Building Detection from High Resolution Satellite Imagery," arXiv:2107.12283, 2021.</w:t>
+        <w:t xml:space="preserve">[9] W. Sirko et al., "Continental-Scale Building Detection from High Resolution Satellite Imagery," arXiv:2107.12283, 2021, doi: 10.48550/arXiv.2107.12283.</w:t>
       </w:r>
     </w:p>
     <w:p>
@@ -2942,7 +2942,7 @@
           <w:sz w:val="18"/>
           <w:szCs w:val="18"/>
         </w:rPr>
-        <w:t xml:space="preserve">[10] National Commission on Population, Ministry of Health and Family Welfare, Government of India, "Population Projections for India and States 2011-2036," Report of the Technical Group on Population Projections, 2020.</w:t>
+        <w:t xml:space="preserve">[10] National Commission on Population, Ministry of Health and Family Welfare, Government of India, "Population Projections for India and States 2011-2036," Report of the Technical Group on Population Projections, 2020. (No DOI -- government report.)</w:t>
       </w:r>
     </w:p>
     <w:p>
@@ -2955,7 +2955,7 @@
           <w:sz w:val="18"/>
           <w:szCs w:val="18"/>
         </w:rPr>
-        <w:t xml:space="preserve">[11] A. Getis and J. K. Ord, "The Analysis of Spatial Association by Use of Distance Statistics," Geogr. Anal., vol. 24, no. 3, pp. 189-206, 1992.</w:t>
+        <w:t xml:space="preserve">[11] A. Getis and J. K. Ord, "The Analysis of Spatial Association by Use of Distance Statistics," Geogr. Anal., vol. 24, no. 3, pp. 189-206, 1992, doi: 10.1111/j.1538-4632.1992.tb00261.x.</w:t>
       </w:r>
     </w:p>
     <w:p>
@@ -2968,7 +2968,7 @@
           <w:sz w:val="18"/>
           <w:szCs w:val="18"/>
         </w:rPr>
-        <w:t xml:space="preserve">[12] P. A. P. Moran, "Notes on Continuous Stochastic Phenomena," Biometrika, vol. 37, no. 1/2, pp. 17-23, 1950.</w:t>
+        <w:t xml:space="preserve">[12] P. A. P. Moran, "Notes on Continuous Stochastic Phenomena," Biometrika, vol. 37, no. 1/2, pp. 17-23, 1950, doi: 10.1093/biomet/37.1-2.17.</w:t>
       </w:r>
     </w:p>
     <w:sectPr>

</xml_diff>

<commit_message>
Fix title font size and document-wide font to match IEEE convention
Title was rendering at 15pt (size:30 half-points, a units mistake) vs.
the reference paper's 24pt -- fixed to size:48. Also set Times New
Roman as the document-wide default font (was falling back to Word's
theme default, Calibri/Aptos, since no font was ever specified) to
match both the IEEE standard and the reference paper's typography.

Co-Authored-By: Claude Sonnet 5 <noreply@anthropic.com>
Claude-Session: https://claude.ai/code/session_01L1F9LReU4niduJQwfTFQLh
</commit_message>
<xml_diff>
--- a/Bhopal_Urban_Morphology_UMAP/Bhopal_Urban_Morphology_FullPaper_DRAFT.docx
+++ b/Bhopal_Urban_Morphology_UMAP/Bhopal_Urban_Morphology_FullPaper_DRAFT.docx
@@ -11,8 +11,8 @@
         <w:rPr>
           <w:b/>
           <w:bCs/>
-          <w:sz w:val="30"/>
-          <w:szCs w:val="30"/>
+          <w:sz w:val="48"/>
+          <w:szCs w:val="48"/>
         </w:rPr>
         <w:t xml:space="preserve">Machine Learning-Based Urban Morphological Signature Mapping Using Open Building Footprints and UMAP Clustering: A Grid-Based Assessment of Bhopal City, India</w:t>
       </w:r>
@@ -3159,7 +3159,11 @@
 <file path=word/styles.xml><?xml version="1.0" encoding="utf-8"?>
 <w:styles xmlns:mc="http://schemas.openxmlformats.org/markup-compatibility/2006" xmlns:r="http://schemas.openxmlformats.org/officeDocument/2006/relationships" xmlns:w="http://schemas.openxmlformats.org/wordprocessingml/2006/main" xmlns:w14="http://schemas.microsoft.com/office/word/2010/wordml" xmlns:w15="http://schemas.microsoft.com/office/word/2012/wordml" mc:Ignorable="w14 w15">
   <w:docDefaults>
-    <w:rPrDefault/>
+    <w:rPrDefault>
+      <w:rPr>
+        <w:rFonts w:ascii="Times New Roman" w:cs="Times New Roman" w:eastAsia="Times New Roman" w:hAnsi="Times New Roman"/>
+      </w:rPr>
+    </w:rPrDefault>
     <w:pPrDefault/>
   </w:docDefaults>
   <w:style w:type="paragraph" w:styleId="Title">

</xml_diff>

<commit_message>
Fix title spanning full page width (was squeezed into one column)
Root cause found from the user's side-by-side screenshot: the title
paragraph was the first child of the two-column body section, so Word
wrapped it into just the first column's width -- narrow and tall --
instead of spanning the full page like a title should.

Split title/authors/abstract/keywords into their own single-column
section placed before the two-column body begins, matching the
reference paper's layout (full-width masthead, then two-column body).
Verified: document now has 4 sections with column pattern
1 (title) -> 2 (body) -> 1 (figures) -> 2 (references).

Co-Authored-By: Claude Sonnet 5 <noreply@anthropic.com>
Claude-Session: https://claude.ai/code/session_01L1F9LReU4niduJQwfTFQLh
</commit_message>
<xml_diff>
--- a/Bhopal_Urban_Morphology_UMAP/Bhopal_Urban_Morphology_FullPaper_DRAFT.docx
+++ b/Bhopal_Urban_Morphology_UMAP/Bhopal_Urban_Morphology_FullPaper_DRAFT.docx
@@ -236,6 +236,18 @@
         </w:rPr>
         <w:t xml:space="preserve">Urban Morphology; Open Building Footprints; UMAP; K-Means Clustering; Local Moran's I; Spatial Autocorrelation; Cluster Validation; Urban Morphological Index; Bhopal; GIS</w:t>
       </w:r>
+    </w:p>
+    <w:p>
+      <w:pPr>
+        <w:sectPr>
+          <w:type w:val="continuous"/>
+          <w:pgSz w:w="12240" w:h="15840" w:orient="portrait"/>
+          <w:pgMar w:top="1440" w:right="1080" w:bottom="1440" w:left="1080" w:header="708" w:footer="708" w:gutter="0"/>
+          <w:pgNumType/>
+          <w:cols w:num="1"/>
+          <w:docGrid w:linePitch="360"/>
+        </w:sectPr>
+      </w:pPr>
     </w:p>
     <w:p>
       <w:pPr>

</xml_diff>